<commit_message>
Docs: tell customers to enable each Job after creating it
Validation on the tenant showed a newly created Job can land disabled (no next-run
time, never fires — tracker stays empty, Scan no-ops). Add an explicit 'enable each
Job' step to all four docs: README minimal-install, Playbooks/README job setup,
Customer Guide 10.5 + 13.2, and the Test Guide (minimal-import slide + Test 9).

Co-Authored-By: Claude Fable 5 <noreply@anthropic.com>
</commit_message>
<xml_diff>
--- a/docs/KOI_Integration_Customer_Guide_v1.4.0.docx
+++ b/docs/KOI_Integration_Customer_Guide_v1.4.0.docx
@@ -9077,6 +9077,36 @@
           <w:szCs w:val="22"/>
         </w:rPr>
         <w:t xml:space="preserve">. Save, then use Run now for an immediate first run.</w:t>
+      </w:r>
+    </w:p>
+    <w:p>
+      <w:pPr>
+        <w:pStyle w:val="ListParagraph"/>
+        <w:numPr>
+          <w:ilvl w:val="0"/>
+          <w:numId w:val="6"/>
+        </w:numPr>
+        <w:spacing w:after="80"/>
+      </w:pPr>
+      <w:r>
+        <w:rPr>
+          <w:rFonts w:ascii="Calibri" w:cs="Calibri" w:eastAsia="Calibri" w:hAnsi="Calibri"/>
+          <w:b/>
+          <w:bCs/>
+          <w:color w:val="1F2937"/>
+          <w:sz w:val="22"/>
+          <w:szCs w:val="22"/>
+        </w:rPr>
+        <w:t xml:space="preserve">Enable both Jobs. </w:t>
+      </w:r>
+      <w:r>
+        <w:rPr>
+          <w:rFonts w:ascii="Calibri" w:cs="Calibri" w:eastAsia="Calibri" w:hAnsi="Calibri"/>
+          <w:color w:val="1F2937"/>
+          <w:sz w:val="22"/>
+          <w:szCs w:val="22"/>
+        </w:rPr>
+        <w:t xml:space="preserve">A newly created Job can be disabled by default. Confirm the scheduling toggle is on and a next-run time is shown for each — otherwise the Job never fires, the tracker stays empty, and Scan has nothing to do.</w:t>
       </w:r>
     </w:p>
     <w:p>
@@ -13144,7 +13174,7 @@
           <w:sz w:val="22"/>
           <w:szCs w:val="22"/>
         </w:rPr>
-        <w:t xml:space="preserve">Then create the JSON List "Koi Script Runner" (Settings → Configurations → Object Setup → Lists → New List, type JSON) and two time-triggered Jobs: a Refresh Job on "Koi Unified - Refresh Tracker" (infrequent) and a Scan Job on "Koi Unified - Script Runner" (frequent). The per-scope tracker Lists are created automatically by the first Refresh run.</w:t>
+        <w:t xml:space="preserve">Then create the JSON List "Koi Script Runner" (Settings → Configurations → Object Setup → Lists → New List, type JSON) and two time-triggered Jobs: a Refresh Job on "Koi Unified - Refresh Tracker" (infrequent) and a Scan Job on "Koi Unified - Script Runner" (frequent). Enable both Jobs after creating them — confirm each shows a next-run time, or it will not fire. Run Refresh once before the first Scan; the per-scope tracker Lists are created automatically by that first Refresh run.</w:t>
       </w:r>
     </w:p>
     <w:p>

</xml_diff>